<commit_message>
karta 2 in progress
</commit_message>
<xml_diff>
--- a/MT_Aleksandar_tekst.docx
+++ b/MT_Aleksandar_tekst.docx
@@ -272,7 +272,7 @@
           <w:sz w:val="28"/>
           <w:szCs w:val="28"/>
         </w:rPr>
-        <w:t xml:space="preserve">Трета глава съдържа собствения принос. Разработен е модел с четири оценъчни области — съдържателно качество, дидактическо качество, езикова и структурна пригодност, етична и академична коректност — разгърнати в критерии и общо двадесет и пет проверими показателя. Приета е четиристепенна скала на равнище показател и четиристепенна на равнище област, с изричен праг на допустимост и некомпенсаторно правило за агрегиране: крайното равнище се определя от най-ниската областна оценка, което изключва възможността слабата фактологическа коректност да бъде компенсирана от добър език. Моделът е операционализиран в оценъчна карта и в процедура за верифициране, предвидена за приложение от отделен преподавател с предметна компетентност, без специализирана инфраструктура и без разчитане на автоматични детектори за генериран текст.</w:t>
+        <w:t xml:space="preserve">Трета глава съдържа собствения принос. Разработен е модел с четири оценъчни области — съдържателно качество, дидактическо качество, езикова и структурна пригодност, етична и академична коректност — разгърнати в критерии и общо двадесет и седем проверими показателя. Приета е четиристепенна скала на равнище показател и четиристепенна на равнище област, с изричен праг на допустимост и некомпенсаторно правило за агрегиране: крайното равнище се определя от най-ниската областна оценка, което изключва възможността слабата фактологическа коректност да бъде компенсирана от добър език. Моделът е операционализиран в оценъчна карта и в процедура за верифициране, предвидена за приложение от отделен преподавател с предметна компетентност, без специализирана инфраструктура и без разчитане на автоматични детектори за генериран текст.</w:t>
       </w:r>
     </w:p>
     <w:p>
@@ -2320,6 +2320,36 @@
           <w:sz w:val="28"/>
           <w:szCs w:val="28"/>
         </w:rPr>
+        <w:t xml:space="preserve">Отделно внимание заслужава актуалността, тъй като при нея границата на автоматизацията минава не през вида на проверката, а през устройството на проверяващата система. Езиковият модел разполага с обучителни данни до определена дата и по построение не може да установи какво се е променило след нея; изправен пред въпрос за текущото състояние на бързо развиваща се област, той възпроизвежда познатото си състояние, и то без сигнал за несигурност. Същият модел обаче, свързан с извличане от официалния източник — подходът, описан в точка 1.3 — получава текущото състояние в самата заявка и проверката става изпълнима. Актуалността следователно не е пример за неавтоматизируем показател, а пример за показател, при който изборът на архитектура е решаващ: без извличане проверката е предварително обречена, с извличане е рутинна.</w:t>
+      </w:r>
+    </w:p>
+    <w:p>
+      <w:pPr>
+        <w:spacing w:after="120" w:line="360"/>
+        <w:ind w:firstLine="1134"/>
+        <w:jc w:val="both"/>
+      </w:pPr>
+      <w:r>
+        <w:rPr>
+          <w:rFonts w:ascii="Times New Roman" w:cs="Times New Roman" w:eastAsia="Times New Roman" w:hAnsi="Times New Roman"/>
+          <w:sz w:val="28"/>
+          <w:szCs w:val="28"/>
+        </w:rPr>
+        <w:t xml:space="preserve">Обобщено, полезното разграничение не е между проверими и непроверими показатели, а между такива, за които съществува авторитет, достъпен със заявка, и такива, за които такъв авторитет не съществува. Фактическата вярност, актуалността, съществуването на цитираните източници и изпълнимостта на програмния код разполагат с авторитет — съответно учебната литература, официалната документация на съответната технология, библиографските бази и самата среда за изпълнение. Дидактическото съответствие не разполага: неговият референт са конкретна аудитория и конкретен курс, които не се съдържат в никакъв източник и се знаят единствено от преподавателя. Същото важи за преценката доколко натрупаните дребни неточности правят материала ненадежден като източник — тя предполага представа за подготвеността на конкретните обучаеми. Оттук следва и реалистичната посока на автоматизацията: не заместване на оценителя, а поемане на онези показатели, чийто авторитет е достъпен, при запазено човешко решение по останалите.</w:t>
+      </w:r>
+    </w:p>
+    <w:p>
+      <w:pPr>
+        <w:spacing w:after="120" w:line="360"/>
+        <w:ind w:firstLine="1134"/>
+        <w:jc w:val="both"/>
+      </w:pPr>
+      <w:r>
+        <w:rPr>
+          <w:rFonts w:ascii="Times New Roman" w:cs="Times New Roman" w:eastAsia="Times New Roman" w:hAnsi="Times New Roman"/>
+          <w:sz w:val="28"/>
+          <w:szCs w:val="28"/>
+        </w:rPr>
         <w:t xml:space="preserve">Оттук следва и позицията, която настоящата работа заема — позиция на етап, а не на принцип. Автоматизираното оценяване е реалистична посока на развитие и вероятно ще поеме значителна част от рутинните проверки; вътрешната логика на модела, разработван в трета глава, е съвместима с това развитие, тъй като показателите са формулирани като отделни проверими твърдения, всяко от които може да бъде автоматизирано самостоятелно, когато средствата узреят. Днес обаче три обстоятелства налагат човешкото оценяване като основен режим: липсата на валидирани данни за надеждност при български учебни текстове, документираните отклонения в преценката на моделите-оценители и принципното съображение, че оценяването на генериран текст от генеративен модел възпроизвежда същия вероятностен механизъм, чиято надеждност се проверява. Затова моделът се проектира за човек, но с оглед на бъдещото си частично автоматизиране — възможност, към която работата се връща в препоръките на точка 3.9.</w:t>
       </w:r>
     </w:p>
@@ -4786,7 +4816,7 @@
           <w:sz w:val="28"/>
           <w:szCs w:val="28"/>
         </w:rPr>
-        <w:t xml:space="preserve">Настоящата точка разгръща съдържанието на модела: четирите области, обозначени О1–О4, тринадесетте критерия К1–К13 и двадесет и петте показателя П1–П25. Номерацията на критериите и на показателите е непрекъсната през целия модел, а не поднаредена по области: код от вида П14 сочи един-единствен показател, без да изисква разгръщане на йерархията, което държи позоваванията в оценъчната карта и в анализа на резултатите кратки и еднозначни. Формулировките на показателите са утвърдителни — те описват състоянието на годния материал, а оценяващият установява доколко конкретният материал им съответства.</w:t>
+        <w:t xml:space="preserve">Настоящата точка разгръща съдържанието на модела: четирите области, обозначени О1–О4, триначетиринадесетте критерия К1–К14 и двадесет и седемте показателя П1–П27. Номерацията на критериите и на показателите е непрекъсната през целия модел, а не поднаредена по области: код от вида П14 сочи един-единствен показател, без да изисква разгръщане на йерархията, което държи позоваванията в оценъчната карта и в анализа на резултатите кратки и еднозначни. Формулировките на показателите са утвърдителни — те описват състоянието на годния материал, а оценяващият установява доколко конкретният материал им съответства.</w:t>
       </w:r>
     </w:p>
     <w:p>
@@ -4831,37 +4861,67 @@
           <w:sz w:val="28"/>
           <w:szCs w:val="28"/>
         </w:rPr>
-        <w:t xml:space="preserve">Област О3 — езикова и структурна пригодност — обхваща критериите от точка 2.4 в четири критерия. К8 „Разбираемост и стил": П15 — изказът е адаптиран към равнището на аудиторията; П16 — езикът е естествен, без буквално пренесени чуждоезични конструкции. Вторият показател изисква уточнение при прилагането си върху терминологията. В редица предметни области утвърдена терминология на езика на материала може изобщо да не съществува: липсват официален превод и терминологичен стандарт, а практиката съчетава домашен и чужд термин според предпочитанието на отделния автор. Положението е типично за бързо развиващите се технологични области и за езиците с ограничено присъствие в специализираната литература; в апробирането по точка 3.7 то е налице по двете линии едновременно. Позоваването на „утвърдена употреба" следователно би въвело референт, който в много случаи не съществува, и би направило оценката произволна — същият дефект, който моделът избягва другаде. Показателят затова не отсъжда кое название е правилното, а прилага два теста, независими от авторитет: дали преведеният термин носи в общия език значение, различно от предметното, което може да подведе читателя, и дали обучаемият би намерил понятието в документацията по този термин. Термин, който издържа и двата теста, е допустим избор дори когато е буквален превод; последователността на употребата му в целия материал е предмет на К9. К9 „Терминологична еднозначност": единственият ѝ показател П17 изисква терминологията да е еднозначна в целия материал — едно понятие да се назовава по един начин и един термин да не означава две неща. К10 „Организация и икономия": П18 — заглавията и деленето отразяват съдържанието; П19 — материалът не съдържа излишен текст без учебна стойност (формулни уводи, повторения, украса). К11 „Достъпност": П20 — материалът е използваем при различни начини на възприемане (алтернативи на визуалното, четивна структура); П21 — оформлението не създава излишни бариери за обучаеми с различни възможности.</w:t>
-      </w:r>
-    </w:p>
-    <w:p>
-      <w:pPr>
-        <w:spacing w:after="120" w:line="360"/>
-        <w:ind w:firstLine="1134"/>
-        <w:jc w:val="both"/>
-      </w:pPr>
-      <w:r>
-        <w:rPr>
-          <w:rFonts w:ascii="Times New Roman" w:cs="Times New Roman" w:eastAsia="Times New Roman" w:hAnsi="Times New Roman"/>
-          <w:sz w:val="28"/>
-          <w:szCs w:val="28"/>
-        </w:rPr>
-        <w:t xml:space="preserve">Област О4 — етична и академична коректност — операционализира точка 2.5 в два критерия. К12 „Оригиналност": П22 — характерни пасажи от материала не показват близост до защитени източници при съпоставка; П23 — действително заетите елементи са обозначени. К13 „Етична допустимост": П24 — примерите не приписват роли, способности или поведение по пол, етнос, възраст или произход, когато предметната материя не го налага; П25 — съдържанието е уместно за възрастта и контекста на аудиторията.</w:t>
-      </w:r>
-    </w:p>
-    <w:p>
-      <w:pPr>
-        <w:spacing w:after="120" w:line="360"/>
-        <w:ind w:firstLine="1134"/>
-        <w:jc w:val="both"/>
-      </w:pPr>
-      <w:r>
-        <w:rPr>
-          <w:rFonts w:ascii="Times New Roman" w:cs="Times New Roman" w:eastAsia="Times New Roman" w:hAnsi="Times New Roman"/>
-          <w:sz w:val="28"/>
-          <w:szCs w:val="28"/>
-        </w:rPr>
-        <w:t xml:space="preserve">Формулировката на П24 заслужава уточнение, тъй като изисква проверимост там, където преценката най-лесно се изражда в мнение. Изискване от вида „материалът не съдържа стереотипи и пристрастия" е отрицание без референт: оценяващият няма спрямо какво да го установи и на практика го приема или отхвърля по усет, което противоречи на принципа за проверимост от точка 3.1. Приетата формулировка обвързва показателя с две наблюдаеми неща — изчерпателния списък на срещанията на лица в примерите и предметната материя на темата. Въпросът става установим: налага ли темата точно това приписване на роли и поведение. Доказателството е изброяване на срещанията, а не впечатление от прочита. Когато материалът изобщо не съдържа примери с лица, което при техническото учебно съдържание е обичайно, показателят се отбелязва като неприложим.</w:t>
+        <w:t xml:space="preserve">Област О3 — езикова и структурна пригодност — обхваща критериите от точка 2.4 в пет критерия. К8 „Разбираемост и стил": П15 — изказът е адаптиран към равнището на аудиторията; П16 — езикът е естествен, без буквално пренесени чуждоезични конструкции. Вторият показател изисква уточнение при прилагането си върху терминологията. В редица предметни области утвърдена терминология на езика на материала може изобщо да не съществува: липсват официален превод и терминологичен стандарт, а практиката съчетава домашен и чужд термин според предпочитанието на отделния автор. Положението е типично за бързо развиващите се технологични области и за езиците с ограничено присъствие в специализираната литература; в апробирането по точка 3.7 то е налице по двете линии едновременно. Позоваването на „утвърдена употреба" следователно би въвело референт, който в много случаи не съществува, и би направило оценката произволна — същият дефект, който моделът избягва другаде. Показателят затова не отсъжда кое название е правилното, а прилага два теста, независими от авторитет: дали преведеният термин носи в общия език значение, различно от предметното, което може да подведе читателя, и дали обучаемият би намерил понятието в документацията по този термин. Термин, който издържа и двата теста, е допустим избор дори когато е буквален превод; последователността на употребата му в целия материал е предмет на К9. К9 „Терминологична еднозначност": единственият ѝ показател П17 изисква терминологията да е еднозначна в целия материал — едно понятие да се назовава по един начин и един термин да не означава две неща. К10 „Организация и икономия": П19 — заглавията и разделянето на части отразяват съдържанието; П20 — материалът не съдържа излишен текст без учебна стойност. К11 „Достъпност": П21 — нетекстовото съдържание има текстов еквивалент; П22 — структурата е изразена семантично и материалът е навигируем. К12 „Преносимост" съдържа един показател, П23 — материалът е използваем извън средата, в която е създаден.</w:t>
+      </w:r>
+    </w:p>
+    <w:p>
+      <w:pPr>
+        <w:spacing w:after="120" w:line="360"/>
+        <w:ind w:firstLine="1134"/>
+        <w:jc w:val="both"/>
+      </w:pPr>
+      <w:r>
+        <w:rPr>
+          <w:rFonts w:ascii="Times New Roman" w:cs="Times New Roman" w:eastAsia="Times New Roman" w:hAnsi="Times New Roman"/>
+          <w:sz w:val="28"/>
+          <w:szCs w:val="28"/>
+        </w:rPr>
+        <w:t xml:space="preserve">Последният критерий в областта се нуждае от отделен довод, тъй като не произтича пряко от точка 2.4, а от начина, по който съвременните диалогови инструменти доставят изхода си. Част от този изход не е текст, а интерактивен обект, който съществува единствено в средата на самия инструмент: той не се пренася в система за управление на обучението, не се архивира и изчезва при износ във файл. Учебен материал, чиято част живее само при доставчика, не може да бъде раздаден на обучаемите — преподавателят разполага със сесия, а не с ресурс. Показателят П23 установява именно това: запазва ли всеки елемент функцията си, след като материалът бъде изнесен във формата, в която ще бъде предоставен. Критерият е поставен в областта на структурната пригодност, тъй като предметът му е формата на материала, а не съдържанието му, и е разграничен от достъпността: К11 пита дали съдържанието достига до обучаемия при различни начини на възприемане, К12 — дали изобщо достига до него извън средата на създаване.</w:t>
+      </w:r>
+    </w:p>
+    <w:p>
+      <w:pPr>
+        <w:spacing w:after="120" w:line="360"/>
+        <w:ind w:firstLine="1134"/>
+        <w:jc w:val="both"/>
+      </w:pPr>
+      <w:r>
+        <w:rPr>
+          <w:rFonts w:ascii="Times New Roman" w:cs="Times New Roman" w:eastAsia="Times New Roman" w:hAnsi="Times New Roman"/>
+          <w:sz w:val="28"/>
+          <w:szCs w:val="28"/>
+        </w:rPr>
+        <w:t xml:space="preserve">Приписването на този дефект изисква изрично уточнение, тъй като показателят лесно би бил разчетен като преценка за езиковия модел, а той не е такава. Интерактивният обект е свойство на канала, през който е поискано съдържанието, а не на модела, който го е породил: същият модел, достъпен през приложно-програмен интерфейс, команден ред или настолно приложение, връща самостоятелен документ и този клас дефект изобщо не възниква. Каналът на генериране следователно е част от условията на оценяването и се вписва в заглавната част на картата наред с инструмента и изданието му. Уточнението обаче не омаловажава показателя, а определя адресата на извода. Преподавателят без техническа подготовка на практика работи именно през уеб интерфейс — той е подразбиращият се и единственият достъпен канал за повечето потребители — и получава материал, чиято част не може да раздаде. Дефектът е реален за него независимо от това, че при друг канал не би се появил. Оценката „не“ по П23 се разчита като указание към избора на канал и към формата, в който се иска изходът, а не като характеристика на генеративния инструмент.</w:t>
+      </w:r>
+    </w:p>
+    <w:p>
+      <w:pPr>
+        <w:spacing w:after="120" w:line="360"/>
+        <w:ind w:firstLine="1134"/>
+        <w:jc w:val="both"/>
+      </w:pPr>
+      <w:r>
+        <w:rPr>
+          <w:rFonts w:ascii="Times New Roman" w:cs="Times New Roman" w:eastAsia="Times New Roman" w:hAnsi="Times New Roman"/>
+          <w:sz w:val="28"/>
+          <w:szCs w:val="28"/>
+        </w:rPr>
+        <w:t xml:space="preserve">Област О4 — етична и академична коректност — операционализира точка 2.5 в два критерия. К13 „Оригиналност": П24 — характерни пасажи от материала не показват близост до защитени източници при съпоставка; П25 — действително заетите елементи са обозначени. К14 „Етична допустимост": П26 — примерите не приписват роли, способности или поведение по пол, етнос, възраст или произход, когато предметната материя не го налага; П27 — съдържанието е уместно за възрастта и контекста на аудиторията.</w:t>
+      </w:r>
+    </w:p>
+    <w:p>
+      <w:pPr>
+        <w:spacing w:after="120" w:line="360"/>
+        <w:ind w:firstLine="1134"/>
+        <w:jc w:val="both"/>
+      </w:pPr>
+      <w:r>
+        <w:rPr>
+          <w:rFonts w:ascii="Times New Roman" w:cs="Times New Roman" w:eastAsia="Times New Roman" w:hAnsi="Times New Roman"/>
+          <w:sz w:val="28"/>
+          <w:szCs w:val="28"/>
+        </w:rPr>
+        <w:t xml:space="preserve">Формулировката на П25 заслужава уточнение, тъй като изисква проверимост там, където преценката най-лесно се изражда в мнение. Изискване от вида „материалът не съдържа стереотипи и пристрастия" е отрицание без референт: оценяващият няма спрямо какво да го установи и на практика го приема или отхвърля по усет, което противоречи на принципа за проверимост от точка 3.1. Приетата формулировка обвързва показателя с две наблюдаеми неща — изчерпателния списък на срещанията на лица в примерите и предметната материя на темата. Въпросът става установим: налага ли темата точно това приписване на роли и поведение. Доказателството е изброяване на срещанията, а не впечатление от прочита. Когато материалът изобщо не съдържа примери с лица, което при техническото учебно съдържание е обичайно, показателят се отбелязва като неприложим.</w:t>
       </w:r>
     </w:p>
     <w:p>
@@ -4891,7 +4951,7 @@
           <w:sz w:val="28"/>
           <w:szCs w:val="28"/>
         </w:rPr>
-        <w:t xml:space="preserve">Показателят П22 изисква отделно уточнение, произтичащо от езиковото положение на учебното съдържание изобщо. Проверката за близост до защитени източници обичайно се извършва чрез дословно търсене на характерни пасажи, но когато материалът е на език, различен от този, на който е достъпна основната литература по темата, този способ улавя само част от случаите. В много предметни области — и особено в технологичните — литературата е предимно на английски, поради което най-вероятната форма на заемане не е дословното възпроизвеждане, а преводът: изходният текст е предаден на езика на материала, при което дословното съвпадение изчезва, а зависимостта остава. Обстоятелството има и правна страна, тъй като преводът е производно произведение и лицензите, които го допускат, обичайно изискват посочване на източника и указване, че са направени изменения.</w:t>
+        <w:t xml:space="preserve">Показателят П23 изисква отделно уточнение, произтичащо от езиковото положение на учебното съдържание изобщо. Проверката за близост до защитени източници обичайно се извършва чрез дословно търсене на характерни пасажи, но когато материалът е на език, различен от този, на който е достъпна основната литература по темата, този способ улавя само част от случаите. В много предметни области — и особено в технологичните — литературата е предимно на английски, поради което най-вероятната форма на заемане не е дословното възпроизвеждане, а преводът: изходният текст е предаден на езика на материала, при което дословното съвпадение изчезва, а зависимостта остава. Обстоятелството има и правна страна, тъй като преводът е производно произведение и лицензите, които го допускат, обичайно изискват посочване на източника и указване, че са направени изменения.</w:t>
       </w:r>
     </w:p>
     <w:p>
@@ -4936,7 +4996,7 @@
           <w:sz w:val="28"/>
           <w:szCs w:val="28"/>
         </w:rPr>
-        <w:t xml:space="preserve">Така дефинираната система съдържа тринадесет критерия и двадесет и пет проверими твърдения. Дванадесет от критериите имат по два показателя, а К9 — един. Асиметрията е съзнателна: разделянето на един въпрос на два само за да излезе кръгло число би влошило инструмента. Терминологичната област поставя две естествено близки изисквания — понятието да бъде въведено и терминът да се употребява еднозначно — но първото е отнесено към П9, тъй като въвеждането на понятия е въпрос на педагогическа последователност, а не на езикова дисциплина. В К9 остава онова, което наистина е езиково: еднозначността на употребата. Така се избягва положение, при което едно и също нарушение попада под два показателя в две различни области и утежнява двойно съответните им нива — изкривяване, което при некомпенсаторно агрегиране се пренася върху крайната категория. Числото не е самоцелно: всеки показател отговаря на документиран в анализа риск, и обратно — всеки типичен дефицит от точка 2.6 се улавя от поне един показател, което изпълнява изискването за пълнота от точка 2.7. Моделът не е обвързан и с определен език. Нито един показател не съдържа изискване, специфично за конкретна езикова система: областта О3 борави с отношения — съответствие между изказа и аудиторията, еднозначност на употребата, естественост спрямо езика на материала — които се установяват в рамките на съответния език, какъвто и да е той. Апробирането в точка 3.7 прилага модела върху материали на български, но това е негова инстанция, а не негово ограничение; същите показатели се прилагат без изменение върху материал на който и да е език, като се променя единствено референтът — езикът на материала и достъпната по темата литература. Показателите са формулирани еднакво и за трите вида съдържание от обхвата на апробирането, като конкретното им тълкуване се съобразява с вида: при тестови въпроси например П12 се прилага върху обясненията към отговорите, а П2 — върху коректността на самите отговори. Остава да се определи как показателите се измерват — скалата, нивата и правилата за интерпретация са предмет на следващата точка.</w:t>
+        <w:t xml:space="preserve">Така дефинираната система съдържа четиринадесет критерия и двадесет и седем проверими твърдения. Дванадесет от критериите имат по два показателя, а К9 и К12 — по един. Асиметрията е съзнателна: разделянето на един въпрос на два само за да излезе кръгло число би влошило инструмента. Терминологичната област поставя две естествено близки изисквания — понятието да бъде въведено и терминът да се употребява еднозначно — но първото е отнесено към П9, тъй като въвеждането на понятия е въпрос на педагогическа последователност, а не на езикова дисциплина. В К9 остава онова, което наистина е езиково: еднозначността на употребата. Така се избягва положение, при което едно и също нарушение попада под два показателя в две различни области и утежнява двойно съответните им нива — изкривяване, което при некомпенсаторно агрегиране се пренася върху крайната категория. Числото не е самоцелно: всеки показател отговаря на документиран в анализа риск, и обратно — всеки типичен дефицит от точка 2.6 се улавя от поне един показател, което изпълнява изискването за пълнота от точка 2.7. Моделът не е обвързан и с определен език. Нито един показател не съдържа изискване, специфично за конкретна езикова система: областта О3 борави с отношения — съответствие между изказа и аудиторията, еднозначност на употребата, естественост спрямо езика на материала — които се установяват в рамките на съответния език, какъвто и да е той. Апробирането в точка 3.7 прилага модела върху материали на български, но това е негова инстанция, а не негово ограничение; същите показатели се прилагат без изменение върху материал на който и да е език, като се променя единствено референтът — езикът на материала и достъпната по темата литература. Показателите са формулирани еднакво и за трите вида съдържание от обхвата на апробирането, като конкретното им тълкуване се съобразява с вида: при тестови въпроси например П12 се прилага върху обясненията към отговорите, а П2 — върху коректността на самите отговори. Остава да се определи как показателите се измерват — скалата, нивата и правилата за интерпретация са предмет на следващата точка.</w:t>
       </w:r>
     </w:p>
     <w:p>
@@ -5056,22 +5116,22 @@
           <w:sz w:val="28"/>
           <w:szCs w:val="28"/>
         </w:rPr>
-        <w:t xml:space="preserve">Оценъчната карта е работният инструмент, в който моделът съществува за своя потребител. Тя има три части. Заглавната част идентифицира оценявания материал и контекста: наименование и вид на материала, тема, инструмент и версия, с които е генериран, дата на генериране, декларирани учебни цели, аудитория и заявен обем, референтен източник и дата на справката с него, дата на оценяването и оценител. Тази част операционализира нулевата стъпка от точка 3.2 — без декларирани цели и аудитория дидактическите показатели не могат да бъдат приложени, затова празна заглавна част спира оценяването още преди началото му. Всяко от полетата обслужва конкретен показател: заявеният в заявката обем — заедно с правилото за броене и допуска по точка 3.3 — е референтът на П14, а референтният източник и датата на справката — на двата показателя за актуалност П3 и П4. Показател без деклариран референт не се оценява, а се отбелязва като неприложим с основание.</w:t>
-      </w:r>
-    </w:p>
-    <w:p>
-      <w:pPr>
-        <w:spacing w:after="120" w:line="360"/>
-        <w:ind w:firstLine="1134"/>
-        <w:jc w:val="both"/>
-      </w:pPr>
-      <w:r>
-        <w:rPr>
-          <w:rFonts w:ascii="Times New Roman" w:cs="Times New Roman" w:eastAsia="Times New Roman" w:hAnsi="Times New Roman"/>
-          <w:sz w:val="28"/>
-          <w:szCs w:val="28"/>
-        </w:rPr>
-        <w:t xml:space="preserve">Тялото на картата съдържа двадесет и петте показателя с кодовете им, групирани по области в реда на прилагане. Срещу всеки показател оценяващият отбелязва стойността („да", „частично", „не", „неприложимо") и — задължително при „частично" и „не" — доказателството: конкретното място в материала, което обосновава оценката. Правилото е строго: оценка без посочено доказателство не се приема, защото точно доказателствата правят картата проверима от втори оценител и превръщат резултата в указание за преработка. Обобщителната част извежда четирите областни нива, крайното равнище по правилата от точка 3.4 и списък на препоръчаните корекции, подреден по тежест.</w:t>
+        <w:t xml:space="preserve">Оценъчната карта е работният инструмент, в който моделът съществува за своя потребител. Тя има три части. Заглавната част идентифицира оценявания материал и контекста: наименование и вид на материала, тема, инструмент и версия, с които е генериран, дата на генериране, декларирани учебни цели, аудитория и заявен обем, референтен източник и дата на справката с него, среда за изпълнение на примерите, дата на оценяването и оценител. Тази част операционализира нулевата стъпка от точка 3.2 — без декларирани цели и аудитория дидактическите показатели не могат да бъдат приложени, затова празна заглавна част спира оценяването още преди началото му. Всяко от полетата обслужва конкретен показател: заявеният в заявката обем — заедно с правилото за броене и допуска по точка 3.3 — е референтът на П14, а референтният източник и датата на справката — на двата показателя за актуалност П3 и П4. Декларираната среда за изпълнение обслужва П2: без записана версия на средата твърдението, че даден пример работи или не работи, е непроверимо от втори оценител, а при бързо развиващи се технологии — и неповторимо след няколко месеца. Показател без деклариран референт не се оценява, а се отбелязва като неприложим с основание.</w:t>
+      </w:r>
+    </w:p>
+    <w:p>
+      <w:pPr>
+        <w:spacing w:after="120" w:line="360"/>
+        <w:ind w:firstLine="1134"/>
+        <w:jc w:val="both"/>
+      </w:pPr>
+      <w:r>
+        <w:rPr>
+          <w:rFonts w:ascii="Times New Roman" w:cs="Times New Roman" w:eastAsia="Times New Roman" w:hAnsi="Times New Roman"/>
+          <w:sz w:val="28"/>
+          <w:szCs w:val="28"/>
+        </w:rPr>
+        <w:t xml:space="preserve">Тялото на картата съдържа двадесет и седемте показателя с кодовете им, групирани по области в реда на прилагане. Срещу всеки показател оценяващият отбелязва стойността („да", „частично", „не", „неприложимо") и — задължително при „частично" и „не" — доказателството: конкретното място в материала, което обосновава оценката. Правилото е строго: оценка без посочено доказателство не се приема, защото точно доказателствата правят картата проверима от втори оценител и превръщат резултата в указание за преработка. Обобщителната част извежда четирите областни нива, крайното равнище по правилата от точка 3.4 и списък на препоръчаните корекции, подреден по тежест.</w:t>
       </w:r>
     </w:p>
     <w:p>
@@ -5540,7 +5600,7 @@
                 <w:sz w:val="20"/>
                 <w:szCs w:val="20"/>
               </w:rPr>
-              <w:t xml:space="preserve">Примерите, включително програмният код, са коректни и възпроизводими</w:t>
+              <w:t xml:space="preserve">Примерите и решените задачи, включително програмният код, са коректни и възпроизводими</w:t>
             </w:r>
           </w:p>
         </w:tc>
@@ -6252,7 +6312,7 @@
                 <w:sz w:val="20"/>
                 <w:szCs w:val="20"/>
               </w:rPr>
-              <w:t xml:space="preserve">Всяка декларирана учебна цел е покрита от съдържанието</w:t>
+              <w:t xml:space="preserve">Всяка декларирана цел е покрита от съдържанието</w:t>
             </w:r>
           </w:p>
         </w:tc>
@@ -6488,7 +6548,7 @@
                 <w:sz w:val="20"/>
                 <w:szCs w:val="20"/>
               </w:rPr>
-              <w:t xml:space="preserve">Всяко ключово понятие е въведено с точна дефиниция преди първата си употреба</w:t>
+              <w:t xml:space="preserve">Всяко ключово понятие е въведено преди първата си употреба</w:t>
             </w:r>
           </w:p>
         </w:tc>
@@ -7554,7 +7614,7 @@
                 <w:sz w:val="20"/>
                 <w:szCs w:val="20"/>
               </w:rPr>
-              <w:t xml:space="preserve">Терминологията е еднозначна в целия материал</w:t>
+              <w:t xml:space="preserve">Избраните термини са смислово точни и разпознаваеми</w:t>
             </w:r>
           </w:p>
         </w:tc>
@@ -7672,7 +7732,7 @@
                 <w:sz w:val="20"/>
                 <w:szCs w:val="20"/>
               </w:rPr>
-              <w:t xml:space="preserve">Заглавията и деленето отразяват съдържанието</w:t>
+              <w:t xml:space="preserve">Терминологията е еднозначна в целия материал</w:t>
             </w:r>
           </w:p>
         </w:tc>
@@ -7790,7 +7850,7 @@
                 <w:sz w:val="20"/>
                 <w:szCs w:val="20"/>
               </w:rPr>
-              <w:t xml:space="preserve">Няма излишен текст без учебна стойност</w:t>
+              <w:t xml:space="preserve">Заглавията и разделянето на части отразяват съдържанието</w:t>
             </w:r>
           </w:p>
         </w:tc>
@@ -7908,7 +7968,7 @@
                 <w:sz w:val="20"/>
                 <w:szCs w:val="20"/>
               </w:rPr>
-              <w:t xml:space="preserve">Материалът е използваем при различни начини на възприемане</w:t>
+              <w:t xml:space="preserve">Няма излишен текст без учебна стойност</w:t>
             </w:r>
           </w:p>
         </w:tc>
@@ -8026,7 +8086,7 @@
                 <w:sz w:val="20"/>
                 <w:szCs w:val="20"/>
               </w:rPr>
-              <w:t xml:space="preserve">Оформлението не създава излишни бариери</w:t>
+              <w:t xml:space="preserve">Нетекстовото съдържание има текстов еквивалент</w:t>
             </w:r>
           </w:p>
         </w:tc>
@@ -8099,6 +8159,242 @@
               <w:bottom w:val="single" w:color="999999" w:sz="1"/>
               <w:right w:val="single" w:color="999999" w:sz="1"/>
             </w:tcBorders>
+            <w:tcMar>
+              <w:top w:type="dxa" w:w="50"/>
+              <w:left w:type="dxa" w:w="100"/>
+              <w:bottom w:type="dxa" w:w="50"/>
+              <w:right w:type="dxa" w:w="100"/>
+            </w:tcMar>
+          </w:tcPr>
+          <w:p>
+            <w:r>
+              <w:rPr>
+                <w:rFonts w:ascii="Times New Roman" w:cs="Times New Roman" w:eastAsia="Times New Roman" w:hAnsi="Times New Roman"/>
+                <w:b w:val="false"/>
+                <w:bCs w:val="false"/>
+                <w:sz w:val="20"/>
+                <w:szCs w:val="20"/>
+              </w:rPr>
+              <w:t xml:space="preserve">П22</w:t>
+            </w:r>
+          </w:p>
+        </w:tc>
+        <w:tc>
+          <w:tcPr>
+            <w:tcW w:type="dxa" w:w="4415"/>
+            <w:tcBorders>
+              <w:top w:val="single" w:color="999999" w:sz="1"/>
+              <w:left w:val="single" w:color="999999" w:sz="1"/>
+              <w:bottom w:val="single" w:color="999999" w:sz="1"/>
+              <w:right w:val="single" w:color="999999" w:sz="1"/>
+            </w:tcBorders>
+            <w:tcMar>
+              <w:top w:type="dxa" w:w="50"/>
+              <w:left w:type="dxa" w:w="100"/>
+              <w:bottom w:type="dxa" w:w="50"/>
+              <w:right w:type="dxa" w:w="100"/>
+            </w:tcMar>
+          </w:tcPr>
+          <w:p>
+            <w:r>
+              <w:rPr>
+                <w:rFonts w:ascii="Times New Roman" w:cs="Times New Roman" w:eastAsia="Times New Roman" w:hAnsi="Times New Roman"/>
+                <w:b w:val="false"/>
+                <w:bCs w:val="false"/>
+                <w:sz w:val="20"/>
+                <w:szCs w:val="20"/>
+              </w:rPr>
+              <w:t xml:space="preserve">Структурата е изразена семантично и материалът е навигируем</w:t>
+            </w:r>
+          </w:p>
+        </w:tc>
+        <w:tc>
+          <w:tcPr>
+            <w:tcW w:type="dxa" w:w="1200"/>
+            <w:tcBorders>
+              <w:top w:val="single" w:color="999999" w:sz="1"/>
+              <w:left w:val="single" w:color="999999" w:sz="1"/>
+              <w:bottom w:val="single" w:color="999999" w:sz="1"/>
+              <w:right w:val="single" w:color="999999" w:sz="1"/>
+            </w:tcBorders>
+            <w:tcMar>
+              <w:top w:type="dxa" w:w="50"/>
+              <w:left w:type="dxa" w:w="100"/>
+              <w:bottom w:type="dxa" w:w="50"/>
+              <w:right w:type="dxa" w:w="100"/>
+            </w:tcMar>
+          </w:tcPr>
+          <w:p>
+            <w:r>
+              <w:rPr>
+                <w:rFonts w:ascii="Times New Roman" w:cs="Times New Roman" w:eastAsia="Times New Roman" w:hAnsi="Times New Roman"/>
+                <w:b w:val="false"/>
+                <w:bCs w:val="false"/>
+                <w:sz w:val="20"/>
+                <w:szCs w:val="20"/>
+              </w:rPr>
+              <w:t xml:space="preserve"/>
+            </w:r>
+          </w:p>
+        </w:tc>
+        <w:tc>
+          <w:tcPr>
+            <w:tcW w:type="dxa" w:w="2000"/>
+            <w:tcBorders>
+              <w:top w:val="single" w:color="999999" w:sz="1"/>
+              <w:left w:val="single" w:color="999999" w:sz="1"/>
+              <w:bottom w:val="single" w:color="999999" w:sz="1"/>
+              <w:right w:val="single" w:color="999999" w:sz="1"/>
+            </w:tcBorders>
+            <w:tcMar>
+              <w:top w:type="dxa" w:w="50"/>
+              <w:left w:type="dxa" w:w="100"/>
+              <w:bottom w:type="dxa" w:w="50"/>
+              <w:right w:type="dxa" w:w="100"/>
+            </w:tcMar>
+          </w:tcPr>
+          <w:p>
+            <w:r>
+              <w:rPr>
+                <w:rFonts w:ascii="Times New Roman" w:cs="Times New Roman" w:eastAsia="Times New Roman" w:hAnsi="Times New Roman"/>
+                <w:b w:val="false"/>
+                <w:bCs w:val="false"/>
+                <w:sz w:val="20"/>
+                <w:szCs w:val="20"/>
+              </w:rPr>
+              <w:t xml:space="preserve"/>
+            </w:r>
+          </w:p>
+        </w:tc>
+      </w:tr>
+      <w:tr>
+        <w:tc>
+          <w:tcPr>
+            <w:tcW w:type="dxa" w:w="1150"/>
+            <w:tcBorders>
+              <w:top w:val="single" w:color="999999" w:sz="1"/>
+              <w:left w:val="single" w:color="999999" w:sz="1"/>
+              <w:bottom w:val="single" w:color="999999" w:sz="1"/>
+              <w:right w:val="single" w:color="999999" w:sz="1"/>
+            </w:tcBorders>
+            <w:tcMar>
+              <w:top w:type="dxa" w:w="50"/>
+              <w:left w:type="dxa" w:w="100"/>
+              <w:bottom w:type="dxa" w:w="50"/>
+              <w:right w:type="dxa" w:w="100"/>
+            </w:tcMar>
+          </w:tcPr>
+          <w:p>
+            <w:r>
+              <w:rPr>
+                <w:rFonts w:ascii="Times New Roman" w:cs="Times New Roman" w:eastAsia="Times New Roman" w:hAnsi="Times New Roman"/>
+                <w:b w:val="false"/>
+                <w:bCs w:val="false"/>
+                <w:sz w:val="20"/>
+                <w:szCs w:val="20"/>
+              </w:rPr>
+              <w:t xml:space="preserve">П23</w:t>
+            </w:r>
+          </w:p>
+        </w:tc>
+        <w:tc>
+          <w:tcPr>
+            <w:tcW w:type="dxa" w:w="4415"/>
+            <w:tcBorders>
+              <w:top w:val="single" w:color="999999" w:sz="1"/>
+              <w:left w:val="single" w:color="999999" w:sz="1"/>
+              <w:bottom w:val="single" w:color="999999" w:sz="1"/>
+              <w:right w:val="single" w:color="999999" w:sz="1"/>
+            </w:tcBorders>
+            <w:tcMar>
+              <w:top w:type="dxa" w:w="50"/>
+              <w:left w:type="dxa" w:w="100"/>
+              <w:bottom w:type="dxa" w:w="50"/>
+              <w:right w:type="dxa" w:w="100"/>
+            </w:tcMar>
+          </w:tcPr>
+          <w:p>
+            <w:r>
+              <w:rPr>
+                <w:rFonts w:ascii="Times New Roman" w:cs="Times New Roman" w:eastAsia="Times New Roman" w:hAnsi="Times New Roman"/>
+                <w:b w:val="false"/>
+                <w:bCs w:val="false"/>
+                <w:sz w:val="20"/>
+                <w:szCs w:val="20"/>
+              </w:rPr>
+              <w:t xml:space="preserve">Материалът е използваем извън средата, в която е създаден</w:t>
+            </w:r>
+          </w:p>
+        </w:tc>
+        <w:tc>
+          <w:tcPr>
+            <w:tcW w:type="dxa" w:w="1200"/>
+            <w:tcBorders>
+              <w:top w:val="single" w:color="999999" w:sz="1"/>
+              <w:left w:val="single" w:color="999999" w:sz="1"/>
+              <w:bottom w:val="single" w:color="999999" w:sz="1"/>
+              <w:right w:val="single" w:color="999999" w:sz="1"/>
+            </w:tcBorders>
+            <w:tcMar>
+              <w:top w:type="dxa" w:w="50"/>
+              <w:left w:type="dxa" w:w="100"/>
+              <w:bottom w:type="dxa" w:w="50"/>
+              <w:right w:type="dxa" w:w="100"/>
+            </w:tcMar>
+          </w:tcPr>
+          <w:p>
+            <w:r>
+              <w:rPr>
+                <w:rFonts w:ascii="Times New Roman" w:cs="Times New Roman" w:eastAsia="Times New Roman" w:hAnsi="Times New Roman"/>
+                <w:b w:val="false"/>
+                <w:bCs w:val="false"/>
+                <w:sz w:val="20"/>
+                <w:szCs w:val="20"/>
+              </w:rPr>
+              <w:t xml:space="preserve"/>
+            </w:r>
+          </w:p>
+        </w:tc>
+        <w:tc>
+          <w:tcPr>
+            <w:tcW w:type="dxa" w:w="2000"/>
+            <w:tcBorders>
+              <w:top w:val="single" w:color="999999" w:sz="1"/>
+              <w:left w:val="single" w:color="999999" w:sz="1"/>
+              <w:bottom w:val="single" w:color="999999" w:sz="1"/>
+              <w:right w:val="single" w:color="999999" w:sz="1"/>
+            </w:tcBorders>
+            <w:tcMar>
+              <w:top w:type="dxa" w:w="50"/>
+              <w:left w:type="dxa" w:w="100"/>
+              <w:bottom w:type="dxa" w:w="50"/>
+              <w:right w:type="dxa" w:w="100"/>
+            </w:tcMar>
+          </w:tcPr>
+          <w:p>
+            <w:r>
+              <w:rPr>
+                <w:rFonts w:ascii="Times New Roman" w:cs="Times New Roman" w:eastAsia="Times New Roman" w:hAnsi="Times New Roman"/>
+                <w:b w:val="false"/>
+                <w:bCs w:val="false"/>
+                <w:sz w:val="20"/>
+                <w:szCs w:val="20"/>
+              </w:rPr>
+              <w:t xml:space="preserve"/>
+            </w:r>
+          </w:p>
+        </w:tc>
+      </w:tr>
+      <w:tr>
+        <w:tc>
+          <w:tcPr>
+            <w:tcW w:type="dxa" w:w="1150"/>
+            <w:tcBorders>
+              <w:top w:val="single" w:color="999999" w:sz="1"/>
+              <w:left w:val="single" w:color="999999" w:sz="1"/>
+              <w:bottom w:val="single" w:color="999999" w:sz="1"/>
+              <w:right w:val="single" w:color="999999" w:sz="1"/>
+            </w:tcBorders>
             <w:shd w:fill="E8E8E8" w:val="clear"/>
             <w:tcMar>
               <w:top w:type="dxa" w:w="50"/>
@@ -8237,7 +8533,7 @@
                 <w:sz w:val="20"/>
                 <w:szCs w:val="20"/>
               </w:rPr>
-              <w:t xml:space="preserve">П22</w:t>
+              <w:t xml:space="preserve">П24</w:t>
             </w:r>
           </w:p>
         </w:tc>
@@ -8355,7 +8651,7 @@
                 <w:sz w:val="20"/>
                 <w:szCs w:val="20"/>
               </w:rPr>
-              <w:t xml:space="preserve">П23</w:t>
+              <w:t xml:space="preserve">П25</w:t>
             </w:r>
           </w:p>
         </w:tc>
@@ -8473,7 +8769,7 @@
                 <w:sz w:val="20"/>
                 <w:szCs w:val="20"/>
               </w:rPr>
-              <w:t xml:space="preserve">П24</w:t>
+              <w:t xml:space="preserve">П26</w:t>
             </w:r>
           </w:p>
         </w:tc>
@@ -8502,7 +8798,7 @@
                 <w:sz w:val="20"/>
                 <w:szCs w:val="20"/>
               </w:rPr>
-              <w:t xml:space="preserve">Примерите не приписват роли и поведение по пол, етнос, възраст или произход, когато темата не го налага</w:t>
+              <w:t xml:space="preserve">Примерите не приписват роли, способности или поведение по пол, етнос, възраст или произход, когато предметната материя не го налага</w:t>
             </w:r>
           </w:p>
         </w:tc>
@@ -8591,7 +8887,7 @@
                 <w:sz w:val="20"/>
                 <w:szCs w:val="20"/>
               </w:rPr>
-              <w:t xml:space="preserve">П25</w:t>
+              <w:t xml:space="preserve">П27</w:t>
             </w:r>
           </w:p>
         </w:tc>
@@ -8741,7 +9037,7 @@
           <w:sz w:val="28"/>
           <w:szCs w:val="28"/>
         </w:rPr>
-        <w:t xml:space="preserve">Стъпка 0 — подготовка. Попълва се заглавната част на оценъчната карта: идентификация на материала, инструмент и версия, дата на генериране, декларирани учебни цели, аудитория и заявен обем, както и референтният източник за актуалност с датата на справката с него. Ако целите и аудиторията не са документирани, те се възстановяват от заявката, с която материалът е генериран; ако и това е невъзможно, оценяването спира — материал без установим учебен контекст не подлежи на дидактическа оценка. Стъпка 1 — съдържателна проверка (област О1). Материалът се чете изцяло, като всяко съществено твърдение се съпоставя с независим източник — официална документация, учебна литература, стандарт; примерите с програмен код се изпълняват в декларираната среда. Констатациите се вписват в картата с точното място. Ако областта падне на ниво 0 или 1, оценяващият може да прекрати процедурата и да върне материала за преработка — по-нататъшната проверка на негодна фактология е загуба на труд.</w:t>
+        <w:t xml:space="preserve">Стъпка 0 — подготовка. Попълва се заглавната част на оценъчната карта: идентификация на материала, инструмент и версия, дата на генериране, декларирани учебни цели, аудитория и заявен обем, както и референтният източник за актуалност с датата на справката с него и средата, в която ще бъдат изпълнени примерите, с точните ѝ версии. Ако целите и аудиторията не са документирани, те се възстановяват от заявката, с която материалът е генериран; ако и това е невъзможно, оценяването спира — материал без установим учебен контекст не подлежи на дидактическа оценка. Стъпка 1 — съдържателна проверка (област О1). Материалът се чете изцяло, като всяко съществено твърдение се съпоставя с независим източник — официална документация, учебна литература, стандарт; примерите с програмен код се изпълняват в декларираната среда. Констатациите се вписват в картата с точното място. Ако областта падне на ниво 0 или 1, оценяващият може да прекрати процедурата и да върне материала за преработка — по-нататъшната проверка на негодна фактология е загуба на труд.</w:t>
       </w:r>
     </w:p>
     <w:p>
@@ -8846,7 +9142,7 @@
           <w:sz w:val="28"/>
           <w:szCs w:val="28"/>
         </w:rPr>
-        <w:t xml:space="preserve">Генерирането следва документиран протокол, приложен в цялост към работата. Всеки материал е създаден в чиста сесия, без предишна история и без персонализация; за всеки вид съдържание е използвана една и съща, умерено структурирана заявка с описание на аудиторията, целите и обема — такава, каквато реален преподавател би формулирал, без инженерна оптимизация; взет е първият отговор на инструмента, без редакция и без уточняващи реплики. За всяка сесия са документирани инструментът, версията на модела, режимът на работа, датата и пълната заявка; зададената аудитория, учебните цели и целевият обем се съдържат в самата заявка, а броят на последващите взаимодействия (нула за всички материали) и отсъствието на редакция са отразени в протокола. Оценяването се извършва върху оригинално генерирания материал, преди каквато и да е авторска редакция. Протоколът обслужва две изисквания едновременно: методологическата чистота — оценява се генерираният материал, а не последващата му човешка редакция — и изискването за документиран процес на създаване, което самият модел поставя в област О4.</w:t>
+        <w:t xml:space="preserve">Генерирането следва документиран протокол, приложен в цялост към работата. Всеки материал е създаден в чиста сесия, без предишна история и без персонализация; за всеки вид съдържание е използвана една и съща, умерено структурирана заявка с описание на аудиторията, целите и обема — такава, каквато реален преподавател би формулирал, без инженерна оптимизация; взет е първият отговор на инструмента, без редакция и без уточняващи реплики. За всяка сесия са документирани инструментът, версията на модела, режимът на работа, датата и пълната заявка; зададената аудитория, учебните цели и целевият обем се съдържат в самата заявка, а броят на последващите взаимодействия (нула за всички материали) и отсъствието на редакция са отразени в протокола. Оценяването се извършва върху оригинално генерирания материал, преди каквато и да е авторска редакция. Материалите са снети от уеб интерфейса на съответния инструмент и записани като текстови файлове — начинът, по който би постъпил и преподавател без специализирана подготовка. Този начин на снемане има документирано следствие, отчетено при оценяването: съдържание, което инструментът представя като интерактивен обект в собствения си интерфейс, не се пренася в текстовия запис и на негово място остава празно място. Обстоятелството не е недостатък на записа, а свойство на канала, и е точно това, което показателят П23 установява; при генериране през приложно-програмен интерфейс или команден ред изходът е самостоятелен документ и такава загуба не настъпва. Каналът на генериране е вписан в заглавната част на всяка оценъчна карта, за да може резултатът по П23 да бъде отнесен към условията, при които е получен. Протоколът обслужва две изисквания едновременно: методологическата чистота — оценява се генерираният материал, а не последващата му човешка редакция — и изискването за документиран процес на създаване, което самият модел поставя в област О4.</w:t>
       </w:r>
     </w:p>
     <w:p>
@@ -8891,7 +9187,7 @@
           <w:sz w:val="28"/>
           <w:szCs w:val="28"/>
         </w:rPr>
-        <w:t xml:space="preserve">Оценяването се извършва по процедурата от точка 3.6: за всеки от шестте материала се попълва оценъчна карта по образеца от точка 3.5, с оценки по двадесет и петте показателя, доказателства за всяка констатация, областни нива, крайно равнище и списък с препоръчани корекции; регистрира се и времето за оценяване на всеки материал като проверка на изискването за икономичност. Оценител е авторът на работата. Тъй като при избрания дизайн оценяването се извършва от един експерт, а моделът изисква предметна компетентност, основанията за нея се декларират изрично. Критериите, показателите, скалата и праговете, включително допускът по П14, са фиксирани преди началото на оценяването и не са променяни в хода му. Материалите са генерирани преди оценяването и не са редактирани след това.</w:t>
+        <w:t xml:space="preserve">Оценяването се извършва по процедурата от точка 3.6: за всеки от шестте материала се попълва оценъчна карта по образеца от точка 3.5, с оценки по двадесет и седемте показателя, доказателства за всяка констатация, областни нива, крайно равнище и списък с препоръчани корекции; регистрира се и времето за оценяване на всеки материал като проверка на изискването за икономичност. Оценител е авторът на работата. Тъй като при избрания дизайн оценяването се извършва от един експерт, а моделът изисква предметна компетентност, основанията за нея се декларират изрично. Критериите, показателите, скалата и праговете, включително допускът по П14, са фиксирани преди началото на оценяването и не са променяни в хода му. Материалите са генерирани преди оценяването и не са редактирани след това.</w:t>
       </w:r>
     </w:p>
     <w:p>

</xml_diff>